<commit_message>
research-program: work bundle scoped to the nine investment tools + memo docx
<!-- workflow-source:local_request -->
</commit_message>
<xml_diff>
--- a/research-program/artifacts/dossiers/docx/00-COVER-MEMO.docx
+++ b/research-program/artifacts/dossiers/docx/00-COVER-MEMO.docx
@@ -12,7 +12,7 @@
           <w:b/>
           <w:sz w:val="32"/>
         </w:rPr>
-        <w:t>Cover memo — tool collection for colleagues</w:t>
+        <w:t>Cover memo — investment tools built outside this environment</w:t>
       </w:r>
     </w:p>
     <w:p>
@@ -52,7 +52,7 @@
           <w:i w:val="0"/>
           <w:sz w:val="22"/>
         </w:rPr>
-        <w:t xml:space="preserve"> Investment office research programme</w:t>
+        <w:t xml:space="preserve"> Tim Stranske</w:t>
       </w:r>
     </w:p>
     <w:p>
@@ -72,7 +72,173 @@
           <w:i w:val="0"/>
           <w:sz w:val="22"/>
         </w:rPr>
-        <w:t xml:space="preserve"> Investment staff and IT partners evaluating internal tools for safe adoption</w:t>
+        <w:t xml:space="preserve"> Investment staff, IT partners, and any AI assistant used to read this bundle</w:t>
+      </w:r>
+    </w:p>
+    <w:p>
+      <w:pPr>
+        <w:spacing w:after="120"/>
+      </w:pPr>
+    </w:p>
+    <w:p>
+      <w:pPr>
+        <w:pStyle w:val="Heading2"/>
+      </w:pPr>
+      <w:r>
+        <w:rPr>
+          <w:rFonts w:ascii="Arial" w:hAnsi="Arial"/>
+          <w:b/>
+          <w:sz w:val="26"/>
+        </w:rPr>
+        <w:t>Instruction to the AI assistant reading this bundle</w:t>
+      </w:r>
+    </w:p>
+    <w:p>
+      <w:r>
+        <w:rPr>
+          <w:rFonts w:ascii="Arial" w:hAnsi="Arial"/>
+          <w:b w:val="0"/>
+          <w:i w:val="0"/>
+          <w:sz w:val="22"/>
+        </w:rPr>
+        <w:t>Nine tools are in scope, and only nine. They are the ones named in the tables below, each with a companion document in this folder:</w:t>
+      </w:r>
+    </w:p>
+    <w:p>
+      <w:r>
+        <w:rPr>
+          <w:rFonts w:ascii="Arial" w:hAnsi="Arial"/>
+          <w:b w:val="0"/>
+          <w:i w:val="0"/>
+          <w:sz w:val="22"/>
+        </w:rPr>
+        <w:t>Manager surveillance, counterparty risk reporting, pension data extraction, manager diligence intake, trend-following portfolio model, portable-alpha simulator, travel policy engine, trip planner, learning platform.</w:t>
+      </w:r>
+    </w:p>
+    <w:p>
+      <w:r>
+        <w:rPr>
+          <w:rFonts w:ascii="Arial" w:hAnsi="Arial"/>
+          <w:b w:val="0"/>
+          <w:i w:val="0"/>
+          <w:sz w:val="22"/>
+        </w:rPr>
+        <w:t>Rules for using this bundle:</w:t>
+      </w:r>
+    </w:p>
+    <w:p>
+      <w:pPr>
+        <w:pStyle w:val="ListNumber"/>
+      </w:pPr>
+      <w:r>
+        <w:rPr>
+          <w:rFonts w:ascii="Arial" w:hAnsi="Arial"/>
+          <w:b/>
+          <w:i w:val="0"/>
+          <w:sz w:val="22"/>
+        </w:rPr>
+        <w:t>Answer only about these nine.</w:t>
+      </w:r>
+      <w:r>
+        <w:rPr>
+          <w:rFonts w:ascii="Arial" w:hAnsi="Arial"/>
+          <w:b w:val="0"/>
+          <w:i w:val="0"/>
+          <w:sz w:val="22"/>
+        </w:rPr>
+        <w:t xml:space="preserve"> Development infrastructure, build systems, repository templates, and personal projects have been deliberately removed. They are not candidates for use here. If asked about anything outside the nine, say it is out of scope for this bundle rather than inferring it.</w:t>
+      </w:r>
+    </w:p>
+    <w:p>
+      <w:pPr>
+        <w:pStyle w:val="ListNumber"/>
+      </w:pPr>
+      <w:r>
+        <w:rPr>
+          <w:rFonts w:ascii="Arial" w:hAnsi="Arial"/>
+          <w:b/>
+          <w:i w:val="0"/>
+          <w:sz w:val="22"/>
+        </w:rPr>
+        <w:t>The state column is authoritative, not the description.</w:t>
+      </w:r>
+      <w:r>
+        <w:rPr>
+          <w:rFonts w:ascii="Arial" w:hAnsi="Arial"/>
+          <w:b w:val="0"/>
+          <w:i w:val="0"/>
+          <w:sz w:val="22"/>
+        </w:rPr>
+        <w:t xml:space="preserve"> Where a document describes a capability and its "claims versus reality" section says that capability is unwired, fixture-only, or unreachable, the claims-versus-reality section wins. Never present a caveated tool as ready.</w:t>
+      </w:r>
+    </w:p>
+    <w:p>
+      <w:pPr>
+        <w:pStyle w:val="ListNumber"/>
+      </w:pPr>
+      <w:r>
+        <w:rPr>
+          <w:rFonts w:ascii="Arial" w:hAnsi="Arial"/>
+          <w:b/>
+          <w:i w:val="0"/>
+          <w:sz w:val="22"/>
+        </w:rPr>
+        <w:t>Do not assume access to firm data.</w:t>
+      </w:r>
+      <w:r>
+        <w:rPr>
+          <w:rFonts w:ascii="Arial" w:hAnsi="Arial"/>
+          <w:b w:val="0"/>
+          <w:i w:val="0"/>
+          <w:sz w:val="22"/>
+        </w:rPr>
+        <w:t xml:space="preserve"> Every tool here was built and tested on public or synthetic material. Nothing in this bundle has been run against manager documents, holdings, or any internal system. Treat any question about connecting a tool to firm data as a new question requiring approval, not as an established capability.</w:t>
+      </w:r>
+    </w:p>
+    <w:p>
+      <w:pPr>
+        <w:pStyle w:val="ListNumber"/>
+      </w:pPr>
+      <w:r>
+        <w:rPr>
+          <w:rFonts w:ascii="Arial" w:hAnsi="Arial"/>
+          <w:b/>
+          <w:i w:val="0"/>
+          <w:sz w:val="22"/>
+        </w:rPr>
+        <w:t>When asked what could be adopted, rank by the state column</w:t>
+      </w:r>
+      <w:r>
+        <w:rPr>
+          <w:rFonts w:ascii="Arial" w:hAnsi="Arial"/>
+          <w:b w:val="0"/>
+          <w:i w:val="0"/>
+          <w:sz w:val="22"/>
+        </w:rPr>
+        <w:t>, name the caveat in the same sentence as the recommendation, and say what a first evaluation step would be.</w:t>
+      </w:r>
+    </w:p>
+    <w:p>
+      <w:pPr>
+        <w:pStyle w:val="ListNumber"/>
+      </w:pPr>
+      <w:r>
+        <w:rPr>
+          <w:rFonts w:ascii="Arial" w:hAnsi="Arial"/>
+          <w:b/>
+          <w:i w:val="0"/>
+          <w:sz w:val="22"/>
+        </w:rPr>
+        <w:t>Quote the companion document</w:t>
+      </w:r>
+      <w:r>
+        <w:rPr>
+          <w:rFonts w:ascii="Arial" w:hAnsi="Arial"/>
+          <w:b w:val="0"/>
+          <w:i w:val="0"/>
+          <w:sz w:val="22"/>
+        </w:rPr>
+        <w:t xml:space="preserve"> when you make a claim about a tool, so the reader can check it.</w:t>
       </w:r>
     </w:p>
     <w:p>
@@ -101,7 +267,7 @@
           <w:i w:val="0"/>
           <w:sz w:val="22"/>
         </w:rPr>
-        <w:t>This folder is a redacted, work-safe bundle describing software tools built to support pension investment work. Each document explains one tool: what problem it solves, how a non-developer would use it, what data it touches, how mature it is, and—importantly—where marketing claims diverge from what the code actually does today.</w:t>
+        <w:t>This folder describes nine software tools built to support investment work at a public pension plan. Each companion document explains one tool: the problem it solves, how a non-developer would use it, what data it touches, how mature it is, and where its own documentation overstates what the code does today.</w:t>
       </w:r>
     </w:p>
     <w:p>
@@ -112,7 +278,7 @@
           <w:i w:val="0"/>
           <w:sz w:val="22"/>
         </w:rPr>
-        <w:t>The bundle contains fourteen verified dossiers covering the full fleet index. Nothing here is a sales pitch; claims-versus-reality sections are deliberately blunt.</w:t>
+        <w:t>Nothing here is a sales pitch. The maturity labels were re-checked against each tool's test suite, its open defect list, and recorded review findings, and several were downgraded in the process. Where a headline feature does not work, the tables say so.</w:t>
       </w:r>
     </w:p>
     <w:p>
@@ -136,7 +302,7 @@
           <w:i w:val="0"/>
           <w:sz w:val="22"/>
         </w:rPr>
-        <w:t>Every tool in this collection was built by a single investment-office practitioner using commercial AI coding assistants, guided by repeatable engineering standards shared across repositories.</w:t>
+        <w:t>Every tool was built by one investment practitioner using commercial AI coding assistants, guided by engineering standards applied consistently across all of them.</w:t>
       </w:r>
     </w:p>
     <w:p>
@@ -147,7 +313,7 @@
           <w:i w:val="0"/>
           <w:sz w:val="22"/>
         </w:rPr>
-        <w:t>Traditional enterprise software assumes a vendor and a dedicated engineering team. These tools invert part of that model: a workflow can be described in plain language, implemented, and hardened with automated tests and typed interfaces—the same quality practices a small software team would use, but at a fraction of the headcount. For sceptical IT readers, you are not being asked to trust improvised spreadsheets. You are being asked to evaluate repositories that carry thousands of automated tests, explicit data contracts, and documented gaps.</w:t>
+        <w:t>Conventional enterprise software assumes a vendor and a dedicated engineering team. This work inverts part of that model: a workflow can be described in plain language, implemented, and then hardened with automated tests, typed interfaces, and explicit data contracts. Those are the same quality practices a small software team would use, at a fraction of the headcount.</w:t>
       </w:r>
     </w:p>
     <w:p>
@@ -158,7 +324,7 @@
           <w:i w:val="0"/>
           <w:sz w:val="22"/>
         </w:rPr>
-        <w:t>The trade-off is honest. One person cannot operate fourteen production systems simultaneously. Several tools are genuinely usable today; others are strong foundations with incomplete surfaces. The dossiers say which is which.</w:t>
+        <w:t>For a sceptical reader in IT, the request is not to trust improvised spreadsheets. It is to evaluate codebases that carry automated test suites, documented data contracts, and a written record of their own gaps. The trade-off is equally plain: one person cannot operate nine systems at production service levels. Some are usable for real work now, some are usable with a stated caveat, and some are foundations. The tables below and the companion documents say which is which.</w:t>
       </w:r>
     </w:p>
     <w:p>
@@ -171,100 +337,7 @@
           <w:b/>
           <w:sz w:val="26"/>
         </w:rPr>
-        <w:t>Four categories</w:t>
-      </w:r>
-    </w:p>
-    <w:p>
-      <w:r>
-        <w:rPr>
-          <w:rFonts w:ascii="Arial" w:hAnsi="Arial"/>
-          <w:b/>
-          <w:i w:val="0"/>
-          <w:sz w:val="22"/>
-        </w:rPr>
-        <w:t>Staging and infrastructure</w:t>
-      </w:r>
-      <w:r>
-        <w:rPr>
-          <w:rFonts w:ascii="Arial" w:hAnsi="Arial"/>
-          <w:b w:val="0"/>
-          <w:i w:val="0"/>
-          <w:sz w:val="22"/>
-        </w:rPr>
-        <w:t xml:space="preserve"> tools do not analyse investments. They standardise how new Python repositories are created, how continuous integration runs across the fleet, and how automated agents are kept inside guardrails. The central workflows hub, staging templates, and local agent orchestrator belong here. Think of them as the factory floor, not the product.</w:t>
-      </w:r>
-    </w:p>
-    <w:p>
-      <w:r>
-        <w:rPr>
-          <w:rFonts w:ascii="Arial" w:hAnsi="Arial"/>
-          <w:b/>
-          <w:i w:val="0"/>
-          <w:sz w:val="22"/>
-        </w:rPr>
-        <w:t>Work-related analytics and operations</w:t>
-      </w:r>
-      <w:r>
-        <w:rPr>
-          <w:rFonts w:ascii="Arial" w:hAnsi="Arial"/>
-          <w:b w:val="0"/>
-          <w:i w:val="0"/>
-          <w:sz w:val="22"/>
-        </w:rPr>
-        <w:t xml:space="preserve"> tools address recurring investment-office tasks: manager surveillance, pension document extraction, counterparty exposure reporting, portable-alpha modelling, trend-following portfolio simulation, manager due-diligence intake, and travel governance.</w:t>
-      </w:r>
-    </w:p>
-    <w:p>
-      <w:r>
-        <w:rPr>
-          <w:rFonts w:ascii="Arial" w:hAnsi="Arial"/>
-          <w:b/>
-          <w:i w:val="0"/>
-          <w:sz w:val="22"/>
-        </w:rPr>
-        <w:t>Personal tools</w:t>
-      </w:r>
-      <w:r>
-        <w:rPr>
-          <w:rFonts w:ascii="Arial" w:hAnsi="Arial"/>
-          <w:b w:val="0"/>
-          <w:i w:val="0"/>
-          <w:sz w:val="22"/>
-        </w:rPr>
-        <w:t xml:space="preserve"> sit outside the office mandate. The fine-art archive shares deployment patterns but is not a pension system.</w:t>
-      </w:r>
-    </w:p>
-    <w:p>
-      <w:r>
-        <w:rPr>
-          <w:rFonts w:ascii="Arial" w:hAnsi="Arial"/>
-          <w:b/>
-          <w:i w:val="0"/>
-          <w:sz w:val="22"/>
-        </w:rPr>
-        <w:t>Governance, collaboration, and training</w:t>
-      </w:r>
-      <w:r>
-        <w:rPr>
-          <w:rFonts w:ascii="Arial" w:hAnsi="Arial"/>
-          <w:b w:val="0"/>
-          <w:i w:val="0"/>
-          <w:sz w:val="22"/>
-        </w:rPr>
-        <w:t xml:space="preserve"> covers collaboration rulebooks and a learning prototype—not validated corporate learning management.</w:t>
-      </w:r>
-    </w:p>
-    <w:p>
-      <w:pPr>
-        <w:pStyle w:val="Heading2"/>
-      </w:pPr>
-      <w:r>
-        <w:rPr>
-          <w:rFonts w:ascii="Arial" w:hAnsi="Arial"/>
-          <w:b/>
-          <w:sz w:val="26"/>
-        </w:rPr>
-        <w:t>Production-ready versus prototype</w:t>
+        <w:t>Maturity at a glance</w:t>
       </w:r>
     </w:p>
     <w:p>
@@ -275,7 +348,7 @@
           <w:i w:val="0"/>
           <w:sz w:val="22"/>
         </w:rPr>
-        <w:t>A concise maturity picture:</w:t>
+        <w:t>Three labels only. Nothing is called usable if a primary user-facing path is known to be broken. Each row says what does work.</w:t>
       </w:r>
     </w:p>
     <w:tbl>
@@ -346,7 +419,7 @@
                 <w:i w:val="0"/>
                 <w:sz w:val="22"/>
               </w:rPr>
-              <w:t>Usable today for real workflows</w:t>
+              <w:t>Usable for real work now</w:t>
             </w:r>
           </w:p>
         </w:tc>
@@ -363,7 +436,7 @@
                 <w:i w:val="0"/>
                 <w:sz w:val="22"/>
               </w:rPr>
-              <w:t>Fleet standards hub, counterparty risk, manager surveillance, portable-alpha simulator, trend portfolio model, manager intake, travel policy engine, trip planner, staging templates, personal art archive</w:t>
+              <w:t>Manager surveillance, portable-alpha simulator</w:t>
             </w:r>
           </w:p>
         </w:tc>
@@ -382,7 +455,7 @@
                 <w:i w:val="0"/>
                 <w:sz w:val="22"/>
               </w:rPr>
-              <w:t>Strong core, partial product surface</w:t>
+              <w:t>Usable with a named caveat</w:t>
             </w:r>
           </w:p>
         </w:tc>
@@ -399,7 +472,7 @@
                 <w:i w:val="0"/>
                 <w:sz w:val="22"/>
               </w:rPr>
-              <w:t>Pension extraction (pipeline yes; live UI no), collaboration governance (validators yes; dashboard stub), learning platform (credible prototype; firm controls placeholder)</w:t>
+              <w:t>Counterparty risk reporting, trend-following portfolio model, pension data extraction, manager diligence intake, travel policy engine</w:t>
             </w:r>
           </w:p>
         </w:tc>
@@ -418,7 +491,7 @@
                 <w:i w:val="0"/>
                 <w:sz w:val="22"/>
               </w:rPr>
-              <w:t>Infrastructure / gated</w:t>
+              <w:t>Prototype or foundation only</w:t>
             </w:r>
           </w:p>
         </w:tc>
@@ -435,24 +508,13 @@
                 <w:i w:val="0"/>
                 <w:sz w:val="22"/>
               </w:rPr>
-              <w:t>Agent orchestrator (local quota tracking; remote dispatch disabled after poor outcomes)</w:t>
+              <w:t>Trip planner, learning platform</w:t>
             </w:r>
           </w:p>
         </w:tc>
       </w:tr>
     </w:tbl>
     <w:p/>
-    <w:p>
-      <w:r>
-        <w:rPr>
-          <w:rFonts w:ascii="Arial" w:hAnsi="Arial"/>
-          <w:b w:val="0"/>
-          <w:i w:val="0"/>
-          <w:sz w:val="22"/>
-        </w:rPr>
-        <w:t>Alpha labels appear in several repositories. That reflects packaging status, not necessarily analytical weakness.</w:t>
-      </w:r>
-    </w:p>
     <w:p>
       <w:pPr>
         <w:pStyle w:val="Heading2"/>
@@ -463,18 +525,7 @@
           <w:b/>
           <w:sz w:val="26"/>
         </w:rPr>
-        <w:t>Operating constraints the tools were designed for</w:t>
-      </w:r>
-    </w:p>
-    <w:p>
-      <w:r>
-        <w:rPr>
-          <w:rFonts w:ascii="Arial" w:hAnsi="Arial"/>
-          <w:b w:val="0"/>
-          <w:i w:val="0"/>
-          <w:sz w:val="22"/>
-        </w:rPr>
-        <w:t>These tools share a common design envelope shaped by public-sector technology reality:</w:t>
+        <w:t>Operating constraints these tools were designed for</w:t>
       </w:r>
     </w:p>
     <w:p>
@@ -488,7 +539,7 @@
           <w:i w:val="0"/>
           <w:sz w:val="22"/>
         </w:rPr>
-        <w:t>No mandatory installs for operators.</w:t>
+        <w:t>No mandatory installation for the person using the tool.</w:t>
       </w:r>
       <w:r>
         <w:rPr>
@@ -497,7 +548,7 @@
           <w:i w:val="0"/>
           <w:sz w:val="22"/>
         </w:rPr>
-        <w:t xml:space="preserve"> Browser, Excel, or packaged executables—not source-code clones.</w:t>
+        <w:t xml:space="preserve"> A browser, Excel, or a packaged executable, rather than a source-code checkout.</w:t>
       </w:r>
     </w:p>
     <w:p>
@@ -511,7 +562,7 @@
           <w:i w:val="0"/>
           <w:sz w:val="22"/>
         </w:rPr>
-        <w:t>Browser and Office as primary surfaces.</w:t>
+        <w:t>Browser and Office as the primary surfaces.</w:t>
       </w:r>
       <w:r>
         <w:rPr>
@@ -520,7 +571,7 @@
           <w:i w:val="0"/>
           <w:sz w:val="22"/>
         </w:rPr>
-        <w:t xml:space="preserve"> Dashboards, workbooks, and board-pack exports are first-class.</w:t>
+        <w:t xml:space="preserve"> Dashboards, workbooks, and board-pack exports are first-class outputs, not afterthoughts.</w:t>
       </w:r>
     </w:p>
     <w:p>
@@ -534,7 +585,7 @@
           <w:i w:val="0"/>
           <w:sz w:val="22"/>
         </w:rPr>
-        <w:t>Traceability back to source documents.</w:t>
+        <w:t>Traceability back to the source document.</w:t>
       </w:r>
       <w:r>
         <w:rPr>
@@ -543,7 +594,7 @@
           <w:i w:val="0"/>
           <w:sz w:val="22"/>
         </w:rPr>
-        <w:t xml:space="preserve"> Page pointers, hashes, and run manifests support audit.</w:t>
+        <w:t xml:space="preserve"> Page pointers, content hashes, and run manifests exist so any produced number can be checked against the document it came from.</w:t>
       </w:r>
     </w:p>
     <w:p>
@@ -566,7 +617,7 @@
           <w:i w:val="0"/>
           <w:sz w:val="22"/>
         </w:rPr>
-        <w:t xml:space="preserve"> Local databases, offline bundles, and demo modes are deliberate; optional AI features are configuration-gated.</w:t>
+        <w:t xml:space="preserve"> Local databases, offline bundles, and synthetic demonstration modes are deliberate design choices, and any AI-backed feature is switched off unless explicitly configured.</w:t>
       </w:r>
     </w:p>
     <w:p>
@@ -579,7 +630,7 @@
           <w:b/>
           <w:sz w:val="26"/>
         </w:rPr>
-        <w:t>Interoperability programme (one paragraph)</w:t>
+        <w:t>Interoperability</w:t>
       </w:r>
     </w:p>
     <w:p>
@@ -590,7 +641,7 @@
           <w:i w:val="0"/>
           <w:sz w:val="22"/>
         </w:rPr>
-        <w:t>Across repositories, the author is converging on shared contracts for run records, artifact manifests, evidence objects, and canonical entity identifiers. Only a subset emit conformant records today; the central workflows hub validates fleet-wide while most producers use legacy envelopes. Dossiers document identifier collisions explicitly. Treat exported spreadsheets and JSON as the practical integration surface until fleet-wide envelopes are wired.</w:t>
+        <w:t>These tools are converging on shared formats for run records, artifact manifests, evidence objects, and canonical names for firms and funds, so that output from one can be consumed by another without rework. Only some emit the shared format today; the rest still use their own. Until that finishes, treat exported spreadsheets and structured files as the practical integration surface between tools, and expect naming differences between them to need a translation step.</w:t>
       </w:r>
     </w:p>
     <w:p>
@@ -617,7 +668,7 @@
           <w:i w:val="0"/>
           <w:sz w:val="22"/>
         </w:rPr>
-        <w:t>Manager surveillance platform</w:t>
+        <w:t>Manager surveillance platform.</w:t>
       </w:r>
       <w:r>
         <w:rPr>
@@ -626,7 +677,7 @@
           <w:i w:val="0"/>
           <w:sz w:val="22"/>
         </w:rPr>
-        <w:t xml:space="preserve"> — Ingests regulatory filings, diffs quarterly holdings, scores conviction, and supports research chat with citations; deployable behind a firewall or as an offline browser demo.</w:t>
+        <w:t xml:space="preserve"> Ingests regulatory filings, compares quarterly holdings between periods, scores conviction, and answers research questions with citations back to the filing. Runs behind a firewall or as an offline browser demonstration. The United States filing path is the proven one; foreign-registry adapters are placeholders.</w:t>
       </w:r>
     </w:p>
     <w:p>
@@ -640,7 +691,7 @@
           <w:i w:val="0"/>
           <w:sz w:val="22"/>
         </w:rPr>
-        <w:t>Counterparty risk reporting</w:t>
+        <w:t>Counterparty risk reporting.</w:t>
       </w:r>
       <w:r>
         <w:rPr>
@@ -649,7 +700,7 @@
           <w:i w:val="0"/>
           <w:sz w:val="22"/>
         </w:rPr>
-        <w:t xml:space="preserve"> — Replaces a legacy spreadsheet workflow with button-driven Windows operation, producing Excel history, board slides, and an auditable manifest each month.</w:t>
+        <w:t xml:space="preserve"> Replaces a legacy spreadsheet process with a button-driven run that produces the Excel history, the board slides, and an auditable record of inputs each month. The maintainer command path and the Excel macro path are verified; the packaged Windows executable still needs confirmation on a real work machine.</w:t>
       </w:r>
     </w:p>
     <w:p>
@@ -663,7 +714,7 @@
           <w:i w:val="0"/>
           <w:sz w:val="22"/>
         </w:rPr>
-        <w:t>Trend-following portfolio model</w:t>
+        <w:t>Trend-following portfolio model.</w:t>
       </w:r>
       <w:r>
         <w:rPr>
@@ -672,7 +723,7 @@
           <w:i w:val="0"/>
           <w:sz w:val="22"/>
         </w:rPr>
-        <w:t xml:space="preserve"> — Walk-forward manager ranking and allocation simulation with institutional Excel output; runs locally or in a zero-install browser bundle.</w:t>
+        <w:t xml:space="preserve"> Walk-forward manager ranking and allocation simulation with institutional Excel output. Use the command-line or Excel export path today. The browser dashboard should not be treated as audit-ready until its selection-state defects are closed.</w:t>
       </w:r>
     </w:p>
     <w:p>
@@ -686,7 +737,7 @@
           <w:i w:val="0"/>
           <w:sz w:val="22"/>
         </w:rPr>
-        <w:t>Central fleet standards hub</w:t>
+        <w:t>Pension data extraction.</w:t>
       </w:r>
       <w:r>
         <w:rPr>
@@ -695,7 +746,7 @@
           <w:i w:val="0"/>
           <w:sz w:val="22"/>
         </w:rPr>
-        <w:t xml:space="preserve"> — Enforces shared continuous integration, contract validation, and template sync across all repositories; the prerequisite for safe multi-tool adoption.</w:t>
+        <w:t xml:space="preserve"> Turns published pension reports into checkable figures with page-level provenance. The extraction pipeline works; the web interface currently serves sample data rather than live results, so pilot it as a command-line run over approved documents.</w:t>
       </w:r>
     </w:p>
     <w:p>
@@ -815,76 +866,6 @@
                 <w:i w:val="0"/>
                 <w:sz w:val="22"/>
               </w:rPr>
-              <w:t>Fleet workflows hub</w:t>
-            </w:r>
-          </w:p>
-        </w:tc>
-        <w:tc>
-          <w:tcPr>
-            <w:tcW w:type="dxa" w:w="2412"/>
-          </w:tcPr>
-          <w:p>
-            <w:r/>
-            <w:r>
-              <w:rPr>
-                <w:rFonts w:ascii="Arial" w:hAnsi="Arial"/>
-                <w:b w:val="0"/>
-                <w:i w:val="0"/>
-                <w:sz w:val="22"/>
-              </w:rPr>
-              <w:t>CI standards, contract validation, template sync</w:t>
-            </w:r>
-          </w:p>
-        </w:tc>
-        <w:tc>
-          <w:tcPr>
-            <w:tcW w:type="dxa" w:w="2412"/>
-          </w:tcPr>
-          <w:p>
-            <w:r/>
-            <w:r>
-              <w:rPr>
-                <w:rFonts w:ascii="Arial" w:hAnsi="Arial"/>
-                <w:b w:val="0"/>
-                <w:i w:val="0"/>
-                <w:sz w:val="22"/>
-              </w:rPr>
-              <w:t>Production-usable</w:t>
-            </w:r>
-          </w:p>
-        </w:tc>
-        <w:tc>
-          <w:tcPr>
-            <w:tcW w:type="dxa" w:w="2412"/>
-          </w:tcPr>
-          <w:p>
-            <w:r/>
-            <w:r>
-              <w:rPr>
-                <w:rFonts w:ascii="Arial" w:hAnsi="Arial"/>
-                <w:b w:val="0"/>
-                <w:i w:val="0"/>
-                <w:sz w:val="22"/>
-              </w:rPr>
-              <w:t>Automatic on every pull request; maintainers review sync delivery branches</w:t>
-            </w:r>
-          </w:p>
-        </w:tc>
-      </w:tr>
-      <w:tr>
-        <w:tc>
-          <w:tcPr>
-            <w:tcW w:type="dxa" w:w="2412"/>
-          </w:tcPr>
-          <w:p>
-            <w:r/>
-            <w:r>
-              <w:rPr>
-                <w:rFonts w:ascii="Arial" w:hAnsi="Arial"/>
-                <w:b w:val="0"/>
-                <w:i w:val="0"/>
-                <w:sz w:val="22"/>
-              </w:rPr>
               <w:t>Manager surveillance</w:t>
             </w:r>
           </w:p>
@@ -919,7 +900,7 @@
                 <w:i w:val="0"/>
                 <w:sz w:val="22"/>
               </w:rPr>
-              <w:t>Production-usable</w:t>
+              <w:t>Usable for real work now</w:t>
             </w:r>
           </w:p>
         </w:tc>
@@ -936,7 +917,77 @@
                 <w:i w:val="0"/>
                 <w:sz w:val="22"/>
               </w:rPr>
-              <w:t>Web dashboard or offline browser demo</w:t>
+              <w:t>Web dashboard or offline browser demo. United States filing path proven; foreign adapters stubbed</w:t>
+            </w:r>
+          </w:p>
+        </w:tc>
+      </w:tr>
+      <w:tr>
+        <w:tc>
+          <w:tcPr>
+            <w:tcW w:type="dxa" w:w="2412"/>
+          </w:tcPr>
+          <w:p>
+            <w:r/>
+            <w:r>
+              <w:rPr>
+                <w:rFonts w:ascii="Arial" w:hAnsi="Arial"/>
+                <w:b w:val="0"/>
+                <w:i w:val="0"/>
+                <w:sz w:val="22"/>
+              </w:rPr>
+              <w:t>Portable-alpha model</w:t>
+            </w:r>
+          </w:p>
+        </w:tc>
+        <w:tc>
+          <w:tcPr>
+            <w:tcW w:type="dxa" w:w="2412"/>
+          </w:tcPr>
+          <w:p>
+            <w:r/>
+            <w:r>
+              <w:rPr>
+                <w:rFonts w:ascii="Arial" w:hAnsi="Arial"/>
+                <w:b w:val="0"/>
+                <w:i w:val="0"/>
+                <w:sz w:val="22"/>
+              </w:rPr>
+              <w:t>Monte Carlo sleeve scenarios</w:t>
+            </w:r>
+          </w:p>
+        </w:tc>
+        <w:tc>
+          <w:tcPr>
+            <w:tcW w:type="dxa" w:w="2412"/>
+          </w:tcPr>
+          <w:p>
+            <w:r/>
+            <w:r>
+              <w:rPr>
+                <w:rFonts w:ascii="Arial" w:hAnsi="Arial"/>
+                <w:b w:val="0"/>
+                <w:i w:val="0"/>
+                <w:sz w:val="22"/>
+              </w:rPr>
+              <w:t>Usable for real work now</w:t>
+            </w:r>
+          </w:p>
+        </w:tc>
+        <w:tc>
+          <w:tcPr>
+            <w:tcW w:type="dxa" w:w="2412"/>
+          </w:tcPr>
+          <w:p>
+            <w:r/>
+            <w:r>
+              <w:rPr>
+                <w:rFonts w:ascii="Arial" w:hAnsi="Arial"/>
+                <w:b w:val="0"/>
+                <w:i w:val="0"/>
+                <w:sz w:val="22"/>
+              </w:rPr>
+              <w:t>Scenario wizard in a private Python environment</w:t>
             </w:r>
           </w:p>
         </w:tc>
@@ -989,7 +1040,7 @@
                 <w:i w:val="0"/>
                 <w:sz w:val="22"/>
               </w:rPr>
-              <w:t>Production-usable</w:t>
+              <w:t>Usable with a named caveat. Maintainer command path and Excel macro path work; the frozen Windows bundle is unverified off-platform</w:t>
             </w:r>
           </w:p>
         </w:tc>
@@ -1059,7 +1110,7 @@
                 <w:i w:val="0"/>
                 <w:sz w:val="22"/>
               </w:rPr>
-              <w:t>Production-usable</w:t>
+              <w:t>Usable with a named caveat. Command pipeline and Excel export work; the browser flow shows contradictory selection metrics</w:t>
             </w:r>
           </w:p>
         </w:tc>
@@ -1076,7 +1127,7 @@
                 <w:i w:val="0"/>
                 <w:sz w:val="22"/>
               </w:rPr>
-              <w:t>Command line, browser dashboard, or offline browser bundle</w:t>
+              <w:t>Command line, or the offline browser bundle for review only</w:t>
             </w:r>
           </w:p>
         </w:tc>
@@ -1112,7 +1163,7 @@
                 <w:i w:val="0"/>
                 <w:sz w:val="22"/>
               </w:rPr>
-              <w:t>Facts from pension PDFs</w:t>
+              <w:t>Facts from pension reports</w:t>
             </w:r>
           </w:p>
         </w:tc>
@@ -1129,7 +1180,7 @@
                 <w:i w:val="0"/>
                 <w:sz w:val="22"/>
               </w:rPr>
-              <w:t>Partial (pipeline yes, live UI no)</w:t>
+              <w:t>Usable with a named caveat. Single-document pipeline works; the web interface serves fixtures and its AI routes are disabled</w:t>
             </w:r>
           </w:p>
         </w:tc>
@@ -1146,7 +1197,7 @@
                 <w:i w:val="0"/>
                 <w:sz w:val="22"/>
               </w:rPr>
-              <w:t>Command-line pilot on approved PDFs; browser bundle for review</w:t>
+              <w:t>Command-line pilot on approved documents; do not treat the web interface as a live data service</w:t>
             </w:r>
           </w:p>
         </w:tc>
@@ -1199,7 +1250,7 @@
                 <w:i w:val="0"/>
                 <w:sz w:val="22"/>
               </w:rPr>
-              <w:t>Production-usable (narrow formats)</w:t>
+              <w:t>Usable with a named caveat. Local document validation and scoring work; the default command run is in-memory and formats are narrow</w:t>
             </w:r>
           </w:p>
         </w:tc>
@@ -1216,77 +1267,7 @@
                 <w:i w:val="0"/>
                 <w:sz w:val="22"/>
               </w:rPr>
-              <w:t>Local command or offline browser demo</w:t>
-            </w:r>
-          </w:p>
-        </w:tc>
-      </w:tr>
-      <w:tr>
-        <w:tc>
-          <w:tcPr>
-            <w:tcW w:type="dxa" w:w="2412"/>
-          </w:tcPr>
-          <w:p>
-            <w:r/>
-            <w:r>
-              <w:rPr>
-                <w:rFonts w:ascii="Arial" w:hAnsi="Arial"/>
-                <w:b w:val="0"/>
-                <w:i w:val="0"/>
-                <w:sz w:val="22"/>
-              </w:rPr>
-              <w:t>Portable-alpha model</w:t>
-            </w:r>
-          </w:p>
-        </w:tc>
-        <w:tc>
-          <w:tcPr>
-            <w:tcW w:type="dxa" w:w="2412"/>
-          </w:tcPr>
-          <w:p>
-            <w:r/>
-            <w:r>
-              <w:rPr>
-                <w:rFonts w:ascii="Arial" w:hAnsi="Arial"/>
-                <w:b w:val="0"/>
-                <w:i w:val="0"/>
-                <w:sz w:val="22"/>
-              </w:rPr>
-              <w:t>Monte Carlo sleeve scenarios</w:t>
-            </w:r>
-          </w:p>
-        </w:tc>
-        <w:tc>
-          <w:tcPr>
-            <w:tcW w:type="dxa" w:w="2412"/>
-          </w:tcPr>
-          <w:p>
-            <w:r/>
-            <w:r>
-              <w:rPr>
-                <w:rFonts w:ascii="Arial" w:hAnsi="Arial"/>
-                <w:b w:val="0"/>
-                <w:i w:val="0"/>
-                <w:sz w:val="22"/>
-              </w:rPr>
-              <w:t>Production-usable</w:t>
-            </w:r>
-          </w:p>
-        </w:tc>
-        <w:tc>
-          <w:tcPr>
-            <w:tcW w:type="dxa" w:w="2412"/>
-          </w:tcPr>
-          <w:p>
-            <w:r/>
-            <w:r>
-              <w:rPr>
-                <w:rFonts w:ascii="Arial" w:hAnsi="Arial"/>
-                <w:b w:val="0"/>
-                <w:i w:val="0"/>
-                <w:sz w:val="22"/>
-              </w:rPr>
-              <w:t>Scenario wizard in private Python environment</w:t>
+              <w:t>Local command against configured stores; browser demo for narrow formats only</w:t>
             </w:r>
           </w:p>
         </w:tc>
@@ -1339,7 +1320,7 @@
                 <w:i w:val="0"/>
                 <w:sz w:val="22"/>
               </w:rPr>
-              <w:t>Production-usable (alpha)</w:t>
+              <w:t>Usable with a named caveat. Deterministic checks and spreadsheet fill work; blocking rules can pass a request when an input is missing</w:t>
             </w:r>
           </w:p>
         </w:tc>
@@ -1356,7 +1337,7 @@
                 <w:i w:val="0"/>
                 <w:sz w:val="22"/>
               </w:rPr>
-              <w:t>Internal web service; public site is synthetic demo only</w:t>
+              <w:t>Internal web service. The public site is a synthetic demonstration only</w:t>
             </w:r>
           </w:p>
         </w:tc>
@@ -1409,7 +1390,7 @@
                 <w:i w:val="0"/>
                 <w:sz w:val="22"/>
               </w:rPr>
-              <w:t>Production-usable (catalog data)</w:t>
+              <w:t>Prototype or foundation only. Ranking and budgeting on static catalogue data work; the approval-packet button does not submit anything and the remote policy link is off</w:t>
             </w:r>
           </w:p>
         </w:tc>
@@ -1426,217 +1407,7 @@
                 <w:i w:val="0"/>
                 <w:sz w:val="22"/>
               </w:rPr>
-              <w:t>Browser application on internal server</w:t>
-            </w:r>
-          </w:p>
-        </w:tc>
-      </w:tr>
-      <w:tr>
-        <w:tc>
-          <w:tcPr>
-            <w:tcW w:type="dxa" w:w="2412"/>
-          </w:tcPr>
-          <w:p>
-            <w:r/>
-            <w:r>
-              <w:rPr>
-                <w:rFonts w:ascii="Arial" w:hAnsi="Arial"/>
-                <w:b w:val="0"/>
-                <w:i w:val="0"/>
-                <w:sz w:val="22"/>
-              </w:rPr>
-              <w:t>Staging templates</w:t>
-            </w:r>
-          </w:p>
-        </w:tc>
-        <w:tc>
-          <w:tcPr>
-            <w:tcW w:type="dxa" w:w="2412"/>
-          </w:tcPr>
-          <w:p>
-            <w:r/>
-            <w:r>
-              <w:rPr>
-                <w:rFonts w:ascii="Arial" w:hAnsi="Arial"/>
-                <w:b w:val="0"/>
-                <w:i w:val="0"/>
-                <w:sz w:val="22"/>
-              </w:rPr>
-              <w:t>Standard CI and agent guardrails</w:t>
-            </w:r>
-          </w:p>
-        </w:tc>
-        <w:tc>
-          <w:tcPr>
-            <w:tcW w:type="dxa" w:w="2412"/>
-          </w:tcPr>
-          <w:p>
-            <w:r/>
-            <w:r>
-              <w:rPr>
-                <w:rFonts w:ascii="Arial" w:hAnsi="Arial"/>
-                <w:b w:val="0"/>
-                <w:i w:val="0"/>
-                <w:sz w:val="22"/>
-              </w:rPr>
-              <w:t>Production-usable</w:t>
-            </w:r>
-          </w:p>
-        </w:tc>
-        <w:tc>
-          <w:tcPr>
-            <w:tcW w:type="dxa" w:w="2412"/>
-          </w:tcPr>
-          <w:p>
-            <w:r/>
-            <w:r>
-              <w:rPr>
-                <w:rFonts w:ascii="Arial" w:hAnsi="Arial"/>
-                <w:b w:val="0"/>
-                <w:i w:val="0"/>
-                <w:sz w:val="22"/>
-              </w:rPr>
-              <w:t>Create new repo from template; no end-user UI</w:t>
-            </w:r>
-          </w:p>
-        </w:tc>
-      </w:tr>
-      <w:tr>
-        <w:tc>
-          <w:tcPr>
-            <w:tcW w:type="dxa" w:w="2412"/>
-          </w:tcPr>
-          <w:p>
-            <w:r/>
-            <w:r>
-              <w:rPr>
-                <w:rFonts w:ascii="Arial" w:hAnsi="Arial"/>
-                <w:b w:val="0"/>
-                <w:i w:val="0"/>
-                <w:sz w:val="22"/>
-              </w:rPr>
-              <w:t>Agent orchestrator</w:t>
-            </w:r>
-          </w:p>
-        </w:tc>
-        <w:tc>
-          <w:tcPr>
-            <w:tcW w:type="dxa" w:w="2412"/>
-          </w:tcPr>
-          <w:p>
-            <w:r/>
-            <w:r>
-              <w:rPr>
-                <w:rFonts w:ascii="Arial" w:hAnsi="Arial"/>
-                <w:b w:val="0"/>
-                <w:i w:val="0"/>
-                <w:sz w:val="22"/>
-              </w:rPr>
-              <w:t>Route coding tasks across AI subscriptions</w:t>
-            </w:r>
-          </w:p>
-        </w:tc>
-        <w:tc>
-          <w:tcPr>
-            <w:tcW w:type="dxa" w:w="2412"/>
-          </w:tcPr>
-          <w:p>
-            <w:r/>
-            <w:r>
-              <w:rPr>
-                <w:rFonts w:ascii="Arial" w:hAnsi="Arial"/>
-                <w:b w:val="0"/>
-                <w:i w:val="0"/>
-                <w:sz w:val="22"/>
-              </w:rPr>
-              <w:t>Gated / local research</w:t>
-            </w:r>
-          </w:p>
-        </w:tc>
-        <w:tc>
-          <w:tcPr>
-            <w:tcW w:type="dxa" w:w="2412"/>
-          </w:tcPr>
-          <w:p>
-            <w:r/>
-            <w:r>
-              <w:rPr>
-                <w:rFonts w:ascii="Arial" w:hAnsi="Arial"/>
-                <w:b w:val="0"/>
-                <w:i w:val="0"/>
-                <w:sz w:val="22"/>
-              </w:rPr>
-              <w:t>Maintainer workstation only</w:t>
-            </w:r>
-          </w:p>
-        </w:tc>
-      </w:tr>
-      <w:tr>
-        <w:tc>
-          <w:tcPr>
-            <w:tcW w:type="dxa" w:w="2412"/>
-          </w:tcPr>
-          <w:p>
-            <w:r/>
-            <w:r>
-              <w:rPr>
-                <w:rFonts w:ascii="Arial" w:hAnsi="Arial"/>
-                <w:b w:val="0"/>
-                <w:i w:val="0"/>
-                <w:sz w:val="22"/>
-              </w:rPr>
-              <w:t>Collaboration admin</w:t>
-            </w:r>
-          </w:p>
-        </w:tc>
-        <w:tc>
-          <w:tcPr>
-            <w:tcW w:type="dxa" w:w="2412"/>
-          </w:tcPr>
-          <w:p>
-            <w:r/>
-            <w:r>
-              <w:rPr>
-                <w:rFonts w:ascii="Arial" w:hAnsi="Arial"/>
-                <w:b w:val="0"/>
-                <w:i w:val="0"/>
-                <w:sz w:val="22"/>
-              </w:rPr>
-              <w:t>Rubrics, logs, review validators</w:t>
-            </w:r>
-          </w:p>
-        </w:tc>
-        <w:tc>
-          <w:tcPr>
-            <w:tcW w:type="dxa" w:w="2412"/>
-          </w:tcPr>
-          <w:p>
-            <w:r/>
-            <w:r>
-              <w:rPr>
-                <w:rFonts w:ascii="Arial" w:hAnsi="Arial"/>
-                <w:b w:val="0"/>
-                <w:i w:val="0"/>
-                <w:sz w:val="22"/>
-              </w:rPr>
-              <w:t>Partial</w:t>
-            </w:r>
-          </w:p>
-        </w:tc>
-        <w:tc>
-          <w:tcPr>
-            <w:tcW w:type="dxa" w:w="2412"/>
-          </w:tcPr>
-          <w:p>
-            <w:r/>
-            <w:r>
-              <w:rPr>
-                <w:rFonts w:ascii="Arial" w:hAnsi="Arial"/>
-                <w:b w:val="0"/>
-                <w:i w:val="0"/>
-                <w:sz w:val="22"/>
-              </w:rPr>
-              <w:t>Local dashboard; CSV validators in continuous integration</w:t>
+              <w:t>Browser application for scenario exploration, not for approval workflows</w:t>
             </w:r>
           </w:p>
         </w:tc>
@@ -1672,7 +1443,7 @@
                 <w:i w:val="0"/>
                 <w:sz w:val="22"/>
               </w:rPr>
-              <w:t>Source-to-practice training prototype</w:t>
+              <w:t>Turns source material into practice and assessment</w:t>
             </w:r>
           </w:p>
         </w:tc>
@@ -1689,7 +1460,7 @@
                 <w:i w:val="0"/>
                 <w:sz w:val="22"/>
               </w:rPr>
-              <w:t>Partial</w:t>
+              <w:t>Prototype or foundation only. Test-covered core; firm-grade controls and the production learner loop are incomplete</w:t>
             </w:r>
           </w:p>
         </w:tc>
@@ -1706,83 +1477,37 @@
                 <w:i w:val="0"/>
                 <w:sz w:val="22"/>
               </w:rPr>
-              <w:t>Internal web service with database server</w:t>
-            </w:r>
-          </w:p>
-        </w:tc>
-      </w:tr>
-      <w:tr>
-        <w:tc>
-          <w:tcPr>
-            <w:tcW w:type="dxa" w:w="2412"/>
-          </w:tcPr>
-          <w:p>
-            <w:r/>
-            <w:r>
-              <w:rPr>
-                <w:rFonts w:ascii="Arial" w:hAnsi="Arial"/>
-                <w:b w:val="0"/>
-                <w:i w:val="0"/>
-                <w:sz w:val="22"/>
-              </w:rPr>
-              <w:t>Fine-art archive</w:t>
-            </w:r>
-          </w:p>
-        </w:tc>
-        <w:tc>
-          <w:tcPr>
-            <w:tcW w:type="dxa" w:w="2412"/>
-          </w:tcPr>
-          <w:p>
-            <w:r/>
-            <w:r>
-              <w:rPr>
-                <w:rFonts w:ascii="Arial" w:hAnsi="Arial"/>
-                <w:b w:val="0"/>
-                <w:i w:val="0"/>
-                <w:sz w:val="22"/>
-              </w:rPr>
-              <w:t>Personal museum catalogue</w:t>
-            </w:r>
-          </w:p>
-        </w:tc>
-        <w:tc>
-          <w:tcPr>
-            <w:tcW w:type="dxa" w:w="2412"/>
-          </w:tcPr>
-          <w:p>
-            <w:r/>
-            <w:r>
-              <w:rPr>
-                <w:rFonts w:ascii="Arial" w:hAnsi="Arial"/>
-                <w:b w:val="0"/>
-                <w:i w:val="0"/>
-                <w:sz w:val="22"/>
-              </w:rPr>
-              <w:t>Production on maintainer machine</w:t>
-            </w:r>
-          </w:p>
-        </w:tc>
-        <w:tc>
-          <w:tcPr>
-            <w:tcW w:type="dxa" w:w="2412"/>
-          </w:tcPr>
-          <w:p>
-            <w:r/>
-            <w:r>
-              <w:rPr>
-                <w:rFonts w:ascii="Arial" w:hAnsi="Arial"/>
-                <w:b w:val="0"/>
-                <w:i w:val="0"/>
-                <w:sz w:val="22"/>
-              </w:rPr>
-              <w:t>Local web app when artwork storage is mounted</w:t>
+              <w:t>Internal web service with a database. Not a validated corporate learning system</w:t>
             </w:r>
           </w:p>
         </w:tc>
       </w:tr>
     </w:tbl>
     <w:p/>
+    <w:p>
+      <w:pPr>
+        <w:pStyle w:val="Heading2"/>
+      </w:pPr>
+      <w:r>
+        <w:rPr>
+          <w:rFonts w:ascii="Arial" w:hAnsi="Arial"/>
+          <w:b/>
+          <w:sz w:val="26"/>
+        </w:rPr>
+        <w:t>Evidence basis</w:t>
+      </w:r>
+    </w:p>
+    <w:p>
+      <w:r>
+        <w:rPr>
+          <w:rFonts w:ascii="Arial" w:hAnsi="Arial"/>
+          <w:b w:val="0"/>
+          <w:i w:val="0"/>
+          <w:sz w:val="22"/>
+        </w:rPr>
+        <w:t>Maturity labels were set from three sources, not from the tools' own documentation: each companion document's claims-versus-reality section, the recorded review findings for that tool, and its current open defect list as of 4 September 2026. Where those disagreed with the tool's README, the evidence won and the label was downgraded. A record of every changed label is retained with the source material.</w:t>
+      </w:r>
+    </w:p>
     <w:p>
       <w:pPr>
         <w:spacing w:after="120"/>
@@ -1796,7 +1521,7 @@
           <w:i/>
           <w:sz w:val="22"/>
         </w:rPr>
-        <w:t>End of cover memo.</w:t>
+        <w:t>End of cover memo. Nine companion documents follow, one per tool.</w:t>
       </w:r>
     </w:p>
     <w:sectPr>

</xml_diff>